<commit_message>
Unify all 7 form generators + add sidebar link
</commit_message>
<xml_diff>
--- a/public/templates/committee-decision-template.docx
+++ b/public/templates/committee-decision-template.docx
@@ -201,7 +201,7 @@
               </w:rPr>
             </w:pPr>
             <w:r>
-              <w:t>{committee_name}</w:t>
+              <w:t>{{committee_name}}</w:t>
             </w:r>
           </w:p>
         </w:tc>
@@ -306,7 +306,7 @@
               </w:rPr>
             </w:pPr>
             <w:r>
-              <w:t>{day}</w:t>
+              <w:t>{{day}}</w:t>
             </w:r>
           </w:p>
         </w:tc>
@@ -364,7 +364,7 @@
               </w:rPr>
             </w:pPr>
             <w:r>
-              <w:t>{date}</w:t>
+              <w:t>{{date}}</w:t>
             </w:r>
           </w:p>
         </w:tc>
@@ -401,7 +401,7 @@
               <w:t>المدة</w:t>
             </w:r>
             <w:r>
-              <w:t>: {duration}</w:t>
+              <w:t>: {{duration}}</w:t>
             </w:r>
           </w:p>
         </w:tc>
@@ -438,7 +438,7 @@
               <w:t>عام دراسي</w:t>
             </w:r>
             <w:r>
-              <w:t>: {academic_year}</w:t>
+              <w:t>: {{academic_year}}</w:t>
             </w:r>
           </w:p>
         </w:tc>
@@ -1636,7 +1636,7 @@
           <w:rtl/>
           <w14:ligatures w14:val="standardContextual"/>
         </w:rPr>
-        <w:t>{committee_name}</w:t>
+        <w:t>{{committee_name}}</w:t>
       </w:r>
       <w:r>
         <w:rPr>
@@ -2107,7 +2107,7 @@
               </w:rPr>
             </w:pPr>
             <w:r>
-              <w:t>{member1_name}</w:t>
+              <w:t>{{member1_name}}</w:t>
             </w:r>
           </w:p>
         </w:tc>
@@ -2128,7 +2128,7 @@
               </w:rPr>
             </w:pPr>
             <w:r>
-              <w:t>{member1_job}</w:t>
+              <w:t>{{member1_job}}</w:t>
             </w:r>
           </w:p>
         </w:tc>
@@ -2230,7 +2230,7 @@
               </w:rPr>
             </w:pPr>
             <w:r>
-              <w:t>{member2_name}</w:t>
+              <w:t>{{member2_name}}</w:t>
             </w:r>
           </w:p>
         </w:tc>
@@ -2251,7 +2251,7 @@
               </w:rPr>
             </w:pPr>
             <w:r>
-              <w:t>{member2_job}</w:t>
+              <w:t>{{member2_job}}</w:t>
             </w:r>
           </w:p>
         </w:tc>
@@ -2353,7 +2353,7 @@
               </w:rPr>
             </w:pPr>
             <w:r>
-              <w:t>{member3_name}</w:t>
+              <w:t>{{member3_name}}</w:t>
             </w:r>
           </w:p>
         </w:tc>
@@ -2374,7 +2374,7 @@
               </w:rPr>
             </w:pPr>
             <w:r>
-              <w:t>{member3_job}</w:t>
+              <w:t>{{member3_job}}</w:t>
             </w:r>
           </w:p>
         </w:tc>
@@ -2476,7 +2476,7 @@
               </w:rPr>
             </w:pPr>
             <w:r>
-              <w:t>{member4_name}</w:t>
+              <w:t>{{member4_name}}</w:t>
             </w:r>
           </w:p>
         </w:tc>
@@ -2497,7 +2497,7 @@
               </w:rPr>
             </w:pPr>
             <w:r>
-              <w:t>{member4_job}</w:t>
+              <w:t>{{member4_job}}</w:t>
             </w:r>
           </w:p>
         </w:tc>
@@ -2599,7 +2599,7 @@
               </w:rPr>
             </w:pPr>
             <w:r>
-              <w:t>{member5_name}</w:t>
+              <w:t>{{member5_name}}</w:t>
             </w:r>
           </w:p>
         </w:tc>
@@ -2620,7 +2620,7 @@
               </w:rPr>
             </w:pPr>
             <w:r>
-              <w:t>{member5_job}</w:t>
+              <w:t>{{member5_job}}</w:t>
             </w:r>
           </w:p>
         </w:tc>
@@ -2722,7 +2722,7 @@
               </w:rPr>
             </w:pPr>
             <w:r>
-              <w:t>{member6_name}</w:t>
+              <w:t>{{member6_name}}</w:t>
             </w:r>
           </w:p>
         </w:tc>
@@ -2743,7 +2743,7 @@
               </w:rPr>
             </w:pPr>
             <w:r>
-              <w:t>{member6_job}</w:t>
+              <w:t>{{member6_job}}</w:t>
             </w:r>
           </w:p>
         </w:tc>
@@ -2845,7 +2845,7 @@
               </w:rPr>
             </w:pPr>
             <w:r>
-              <w:t>{member7_name}</w:t>
+              <w:t>{{member7_name}}</w:t>
             </w:r>
           </w:p>
         </w:tc>
@@ -2866,7 +2866,7 @@
               </w:rPr>
             </w:pPr>
             <w:r>
-              <w:t>{member7_job}</w:t>
+              <w:t>{{member7_job}}</w:t>
             </w:r>
           </w:p>
         </w:tc>
@@ -2968,7 +2968,7 @@
               </w:rPr>
             </w:pPr>
             <w:r>
-              <w:t>{member8_name}</w:t>
+              <w:t>{{member8_name}}</w:t>
             </w:r>
           </w:p>
         </w:tc>
@@ -2989,7 +2989,7 @@
               </w:rPr>
             </w:pPr>
             <w:r>
-              <w:t>{member8_job}</w:t>
+              <w:t>{{member8_job}}</w:t>
             </w:r>
           </w:p>
         </w:tc>
@@ -3111,7 +3111,7 @@
           <w:rtl/>
           <w14:ligatures w14:val="standardContextual"/>
         </w:rPr>
-        <w:t>{principal_name}</w:t>
+        <w:t>{{principal_name}}</w:t>
       </w:r>
     </w:p>
     <w:p>
@@ -5420,7 +5420,7 @@
               </w:rPr>
             </w:pPr>
             <w:r>
-              <w:t>{sem1_meeting1}</w:t>
+              <w:t>{{sem1_meeting1}}</w:t>
             </w:r>
           </w:p>
           <w:p>
@@ -5453,7 +5453,7 @@
               </w:rPr>
             </w:pPr>
             <w:r>
-              <w:t>{sem1_meeting2}</w:t>
+              <w:t>{{sem1_meeting2}}</w:t>
             </w:r>
           </w:p>
         </w:tc>
@@ -5474,7 +5474,7 @@
               </w:rPr>
             </w:pPr>
             <w:r>
-              <w:t>{sem1_meeting3}</w:t>
+              <w:t>{{sem1_meeting3}}</w:t>
             </w:r>
           </w:p>
         </w:tc>
@@ -6012,7 +6012,7 @@
               </w:rPr>
             </w:pPr>
             <w:r>
-              <w:t>{sem2_meeting1}</w:t>
+              <w:t>{{sem2_meeting1}}</w:t>
             </w:r>
           </w:p>
           <w:p>
@@ -6046,7 +6046,7 @@
               </w:rPr>
             </w:pPr>
             <w:r>
-              <w:t>{sem2_meeting2}</w:t>
+              <w:t>{{sem2_meeting2}}</w:t>
             </w:r>
           </w:p>
         </w:tc>
@@ -6067,7 +6067,7 @@
               </w:rPr>
             </w:pPr>
             <w:r>
-              <w:t>{sem2_meeting3}</w:t>
+              <w:t>{{sem2_meeting3}}</w:t>
             </w:r>
           </w:p>
         </w:tc>

</xml_diff>